<commit_message>
Import episodes from a Word file (admin only): preview, replace, undo; Ep 8 song asterisks fixed
Co-Authored-By: Claude Sonnet 5.5 <noreply@anthropic.com>
Claude-Session: https://claude.ai/code/session_019gsgL5hagwRH8fMt4GCayM
</commit_message>
<xml_diff>
--- a/exports/Maha-Kali-Episodes-4-8-Odia.docx
+++ b/exports/Maha-Kali-Episodes-4-8-Odia.docx
@@ -13486,7 +13486,7 @@
           <w:b w:val="0"/>
           <w:i w:val="0"/>
         </w:rPr>
-        <w:t>*SONG: ମା' କାଳୀଙ୍କ ଭକ୍ତିଗୀତ ଆରମ୍ଭ।*</w:t>
+        <w:t>SONG: ମା' କାଳୀଙ୍କ ଭକ୍ତିଗୀତ ଆରମ୍ଭ।</w:t>
       </w:r>
     </w:p>
     <w:p>
@@ -13512,7 +13512,7 @@
           <w:b w:val="0"/>
           <w:i w:val="0"/>
         </w:rPr>
-        <w:t>*ପ୍ରସ୍ତାବିତ ପଲ୍ଲବୀ (ଗୀତିକାର ବଦଳାଇପାରିବେ):* "ଜୟ ମହାକାଳୀ, ଜୟ ମହାକାଳୀ / ଋଣ ଶୁଝ ମାଆ, ଆଖି ଫେରାଇ ଆଣ।"</w:t>
+        <w:t>ପ୍ରସ୍ତାବିତ ପଲ୍ଲବୀ (ଗୀତିକାର ବଦଳାଇପାରିବେ): "ଜୟ ମହାକାଳୀ, ଜୟ ମହାକାଳୀ / ଋଣ ଶୁଝ ମାଆ, ଆଖି ଫେରାଇ ଆଣ।"</w:t>
       </w:r>
     </w:p>
     <w:p>
@@ -13577,7 +13577,7 @@
           <w:b w:val="0"/>
           <w:i w:val="0"/>
         </w:rPr>
-        <w:t>*(SONG: ୨ ମିନିଟ୍ ୩୦ ସେକେଣ୍ଡ, ଏହି ସିନ୍‌ର ୪ ମିନିଟ୍ ଭିତରେ ସାମିଲ।)*</w:t>
+        <w:t>(SONG: ୨ ମିନିଟ୍ ୩୦ ସେକେଣ୍ଡ, ଏହି ସିନ୍‌ର ୪ ମିନିଟ୍ ଭିତରେ ସାମିଲ।)</w:t>
       </w:r>
     </w:p>
     <w:p>

</xml_diff>